<commit_message>
Aclarar en el informe que el despliegue en AWS ya esta ejecutado
Los parrafos de arquitectura y conclusiones describian la infraestructura
EC2+S3 en terminos ambiguos (podia leerse como diseno/plan); se ajusta el
texto para dejar explicito que ya esta desplegada y en operacion, ya que
la instancia se volvio a encender y el dashboard esta corriendo.
</commit_message>
<xml_diff>
--- a/informe/CryptoPulse_Analytics_Informe_ProDev.docx
+++ b/informe/CryptoPulse_Analytics_Informe_ProDev.docx
@@ -1635,7 +1635,7 @@
     </w:p>
     <w:p>
       <w:r>
-        <w:t>La arquitectura cubre las cuatro capas requeridas — ingesta, almacenamiento, procesamiento y visualización — sobre infraestructura de capa gratuita de AWS (EC2 t3.micro + S3), apta para una etapa de prototipo/mejora continua de producto.</w:t>
+        <w:t>La arquitectura cubre las cuatro capas requeridas — ingesta, almacenamiento, procesamiento y visualización — sobre infraestructura de capa gratuita de AWS (EC2 t3.micro + S3) ya desplegada y en operación (no solo diseñada), apta para una etapa de prototipo/mejora continua de producto.</w:t>
       </w:r>
     </w:p>
     <w:p>
@@ -2721,7 +2721,7 @@
     </w:p>
     <w:p>
       <w:r>
-        <w:t>CryptoPulse Analytics entrega a ProDev un producto de analítica de mercado — precio, riesgo y momentum — para BTC/ETH/SOL, construido sobre fuentes públicas e infraestructura de bajo costo (capa gratuita de AWS), sin requerir terminales profesionales de pago. Es una herramienta que aporta valor de forma autónoma, como capa de inteligencia de mercado y reporting para la empresa, independiente de cualquier otro proyecto interno.</w:t>
+        <w:t>CryptoPulse Analytics entrega a ProDev un producto de analítica de mercado — precio, riesgo y momentum — para BTC/ETH/SOL, construido y desplegado en producción sobre fuentes públicas e infraestructura de bajo costo (capa gratuita de AWS), sin requerir terminales profesionales de pago. Es una herramienta que aporta valor de forma autónoma, como capa de inteligencia de mercado y reporting para la empresa, independiente de cualquier otro proyecto interno.</w:t>
       </w:r>
     </w:p>
     <w:p>

</xml_diff>

<commit_message>
Quitar el indice del informe y completar datos de portada
Se elimina la seccion "Tabla de contenidos" (encabezado, nota de
instrucciones y el campo TOC vacio de Word), corrigiendo tambien el doble
salto de pagina que quedaba entre la portada y la seccion 1. En la portada
se agregan las filas "Preparado por:" (Luis Andres Gutierrez Gonzalez) y
"Universidad:" (Universidad de las Americas), y se actualiza la fecha al
04 de agosto de 2026.
</commit_message>
<xml_diff>
--- a/informe/CryptoPulse_Analytics_Informe_ProDev.docx
+++ b/informe/CryptoPulse_Analytics_Informe_ProDev.docx
@@ -118,6 +118,68 @@
                 <w:color w:val="2A3F5C"/>
                 <w:sz w:val="22"/>
               </w:rPr>
+              <w:t>Preparado por:</w:t>
+            </w:r>
+          </w:p>
+        </w:tc>
+        <w:tc>
+          <w:tcPr>
+            <w:tcW w:type="dxa" w:w="6520"/>
+          </w:tcPr>
+          <w:p>
+            <w:r>
+              <w:rPr>
+                <w:color w:val="1C2733"/>
+                <w:sz w:val="22"/>
+              </w:rPr>
+              <w:t>Luis Andrés Gutiérrez González</w:t>
+            </w:r>
+          </w:p>
+        </w:tc>
+      </w:tr>
+      <w:tr>
+        <w:tc>
+          <w:tcPr>
+            <w:tcW w:type="dxa" w:w="2041"/>
+          </w:tcPr>
+          <w:p>
+            <w:r>
+              <w:rPr>
+                <w:b/>
+                <w:color w:val="2A3F5C"/>
+                <w:sz w:val="22"/>
+              </w:rPr>
+              <w:t>Universidad:</w:t>
+            </w:r>
+          </w:p>
+        </w:tc>
+        <w:tc>
+          <w:tcPr>
+            <w:tcW w:type="dxa" w:w="6520"/>
+          </w:tcPr>
+          <w:p>
+            <w:r>
+              <w:rPr>
+                <w:color w:val="1C2733"/>
+                <w:sz w:val="22"/>
+              </w:rPr>
+              <w:t>Universidad de las Américas</w:t>
+            </w:r>
+          </w:p>
+        </w:tc>
+      </w:tr>
+      <w:tr>
+        <w:tc>
+          <w:tcPr>
+            <w:tcW w:type="dxa" w:w="2041"/>
+          </w:tcPr>
+          <w:p>
+            <w:r>
+              <w:rPr>
+                <w:b/>
+                <w:color w:val="2A3F5C"/>
+                <w:sz w:val="22"/>
+              </w:rPr>
               <w:t>Curso:</w:t>
             </w:r>
           </w:p>
@@ -194,43 +256,12 @@
                 <w:color w:val="1C2733"/>
                 <w:sz w:val="22"/>
               </w:rPr>
-              <w:t>30 de julio de 2026</w:t>
+              <w:t>04 de agosto de 2026</w:t>
             </w:r>
           </w:p>
         </w:tc>
       </w:tr>
     </w:tbl>
-    <w:p>
-      <w:r>
-        <w:br w:type="page"/>
-      </w:r>
-    </w:p>
-    <w:p>
-      <w:pPr>
-        <w:pStyle w:val="Heading1"/>
-      </w:pPr>
-      <w:r>
-        <w:t>Tabla de contenidos</w:t>
-      </w:r>
-    </w:p>
-    <w:p>
-      <w:r>
-        <w:rPr>
-          <w:i/>
-          <w:color w:val="5A6B7A"/>
-          <w:sz w:val="19"/>
-        </w:rPr>
-        <w:t>(Word: clic derecho sobre el índice → "Actualizar campos" → "Actualizar todo el índice" para generar la lista de secciones y páginas.)</w:t>
-      </w:r>
-    </w:p>
-    <w:p>
-      <w:r>
-        <w:fldChar w:fldCharType="begin"/>
-        <w:instrText xml:space="preserve">TOC \o "1-3" \h \z \u</w:instrText>
-        <w:fldChar w:fldCharType="separate"/>
-        <w:fldChar w:fldCharType="end"/>
-      </w:r>
-    </w:p>
     <w:p>
       <w:r>
         <w:br w:type="page"/>

</xml_diff>